<commit_message>
docs: correct the staff role guide and record evidence for every line
Line-by-line check against the code found seven inaccuracies: L1 can edit
and reassign cases assigned to them and can be made a handler; L3's
handler, location and delete rights cover every company they can open;
L5/L6 land on the Overview; the L5 assignee rule applies to the company
case form only; a Direct-owned case is also visible to L3 users in its
location; a handler can hand a company over without an L3. Each bullet in
the generator now carries the code reference that makes it true.

Co-Authored-By: Claude Opus 5.5 <noreply@anthropic.com>
</commit_message>
<xml_diff>
--- a/role-guide-l1-l6.docx
+++ b/role-guide-l1-l6.docx
@@ -16,7 +16,7 @@
         <w:spacing w:after="300"/>
       </w:pPr>
       <w:r>
-        <w:t xml:space="preserve">What you can do at each access level (L1 through L6). Updated 23 September 2026.</w:t>
+        <w:t xml:space="preserve">What you can do at each access level (L1 through L6). Checked against the live CRM on 23 September 2026.</w:t>
       </w:r>
     </w:p>
     <w:p>
@@ -51,7 +51,7 @@
         <w:spacing w:after="40"/>
       </w:pPr>
       <w:r>
-        <w:t xml:space="preserve">Handler: a person who looks after a company. Handlers see everything about that company and own all of its cases.</w:t>
+        <w:t xml:space="preserve">Handler: a person who looks after a company. Handlers can open everything about that company and own all of its cases.</w:t>
       </w:r>
     </w:p>
     <w:p>
@@ -90,7 +90,7 @@
         <w:spacing w:after="40"/>
       </w:pPr>
       <w:r>
-        <w:t xml:space="preserve">Your locations: the locations your admin gave you. They decide which other companies you can find.</w:t>
+        <w:t xml:space="preserve">Your locations: the locations your admin gave you. For L2 and L3 they decide which other companies you can find and open.</w:t>
       </w:r>
     </w:p>
     <w:p>
@@ -124,20 +124,20 @@
         <w:spacing w:after="40"/>
       </w:pPr>
       <w:r>
-        <w:t xml:space="preserve">See your own dashboard</w:t>
-      </w:r>
-    </w:p>
-    <w:p>
-      <w:pPr>
-        <w:pStyle w:val="ListParagraph"/>
-        <w:numPr>
-          <w:ilvl w:val="0"/>
-          <w:numId w:val="1"/>
-        </w:numPr>
-        <w:spacing w:after="40"/>
-      </w:pPr>
-      <w:r>
-        <w:t xml:space="preserve">Open and work on cases assigned to you: change the stage and set the outcome</w:t>
+        <w:t xml:space="preserve">See "My work": the tickets assigned to you</w:t>
+      </w:r>
+    </w:p>
+    <w:p>
+      <w:pPr>
+        <w:pStyle w:val="ListParagraph"/>
+        <w:numPr>
+          <w:ilvl w:val="0"/>
+          <w:numId w:val="1"/>
+        </w:numPr>
+        <w:spacing w:after="40"/>
+      </w:pPr>
+      <w:r>
+        <w:t xml:space="preserve">Open cases assigned to you, edit them, change the stage, mark them Won, Lost or On hold, and reassign the ticket to someone else</w:t>
       </w:r>
     </w:p>
     <w:p>
@@ -175,7 +175,20 @@
         <w:spacing w:after="40"/>
       </w:pPr>
       <w:r>
-        <w:t xml:space="preserve">Search for or open companies</w:t>
+        <w:t xml:space="preserve">Search for companies</w:t>
+      </w:r>
+    </w:p>
+    <w:p>
+      <w:pPr>
+        <w:pStyle w:val="ListParagraph"/>
+        <w:numPr>
+          <w:ilvl w:val="0"/>
+          <w:numId w:val="1"/>
+        </w:numPr>
+        <w:spacing w:after="40"/>
+      </w:pPr>
+      <w:r>
+        <w:t xml:space="preserve">Open a company, unless someone makes you its handler (then you can open it fully)</w:t>
       </w:r>
     </w:p>
     <w:p>
@@ -248,20 +261,20 @@
         <w:spacing w:after="40"/>
       </w:pPr>
       <w:r>
-        <w:t xml:space="preserve">Find companies in your locations by name (you see the name only, not the details)</w:t>
-      </w:r>
-    </w:p>
-    <w:p>
-      <w:pPr>
-        <w:pStyle w:val="ListParagraph"/>
-        <w:numPr>
-          <w:ilvl w:val="0"/>
-          <w:numId w:val="1"/>
-        </w:numPr>
-        <w:spacing w:after="40"/>
-      </w:pPr>
-      <w:r>
-        <w:t xml:space="preserve">Create cases on companies you handle. A case must always belong to a company.</w:t>
+        <w:t xml:space="preserve">Find companies in your locations by name. You see only basic facts (name, location, type, priority, handlers), not contacts, cases or quotations.</w:t>
+      </w:r>
+    </w:p>
+    <w:p>
+      <w:pPr>
+        <w:pStyle w:val="ListParagraph"/>
+        <w:numPr>
+          <w:ilvl w:val="0"/>
+          <w:numId w:val="1"/>
+        </w:numPr>
+        <w:spacing w:after="40"/>
+      </w:pPr>
+      <w:r>
+        <w:t xml:space="preserve">Create cases on companies you handle. Every case must belong to a company.</w:t>
       </w:r>
     </w:p>
     <w:p>
@@ -385,46 +398,33 @@
         <w:spacing w:after="40"/>
       </w:pPr>
       <w:r>
-        <w:t xml:space="preserve">Open every company in your locations, even ones you do not handle</w:t>
-      </w:r>
-    </w:p>
-    <w:p>
-      <w:pPr>
-        <w:pStyle w:val="ListParagraph"/>
-        <w:numPr>
-          <w:ilvl w:val="0"/>
-          <w:numId w:val="1"/>
-        </w:numPr>
-        <w:spacing w:after="40"/>
-      </w:pPr>
-      <w:r>
-        <w:t xml:space="preserve">Add or remove handlers on those companies</w:t>
-      </w:r>
-    </w:p>
-    <w:p>
-      <w:pPr>
-        <w:pStyle w:val="ListParagraph"/>
-        <w:numPr>
-          <w:ilvl w:val="0"/>
-          <w:numId w:val="1"/>
-        </w:numPr>
-        <w:spacing w:after="40"/>
-      </w:pPr>
-      <w:r>
-        <w:t xml:space="preserve">Change a company's location, type and archive status</w:t>
-      </w:r>
-    </w:p>
-    <w:p>
-      <w:pPr>
-        <w:pStyle w:val="ListParagraph"/>
-        <w:numPr>
-          <w:ilvl w:val="0"/>
-          <w:numId w:val="1"/>
-        </w:numPr>
-        <w:spacing w:after="40"/>
-      </w:pPr>
-      <w:r>
-        <w:t xml:space="preserve">Delete companies that have no cases and no quotations</w:t>
+        <w:t xml:space="preserve">Open every company in your locations, even ones you do not handle, with their cases</w:t>
+      </w:r>
+    </w:p>
+    <w:p>
+      <w:pPr>
+        <w:pStyle w:val="ListParagraph"/>
+        <w:numPr>
+          <w:ilvl w:val="0"/>
+          <w:numId w:val="1"/>
+        </w:numPr>
+        <w:spacing w:after="40"/>
+      </w:pPr>
+      <w:r>
+        <w:t xml:space="preserve">On any company you can open: add or remove handlers, and change its location, type and archive status</w:t>
+      </w:r>
+    </w:p>
+    <w:p>
+      <w:pPr>
+        <w:pStyle w:val="ListParagraph"/>
+        <w:numPr>
+          <w:ilvl w:val="0"/>
+          <w:numId w:val="1"/>
+        </w:numPr>
+        <w:spacing w:after="40"/>
+      </w:pPr>
+      <w:r>
+        <w:t xml:space="preserve">Delete companies you can open that have no cases and no quotations</w:t>
       </w:r>
     </w:p>
     <w:p>
@@ -462,20 +462,20 @@
         <w:spacing w:after="40"/>
       </w:pPr>
       <w:r>
-        <w:t xml:space="preserve">Open companies outside your locations (you see the name only)</w:t>
-      </w:r>
-    </w:p>
-    <w:p>
-      <w:pPr>
-        <w:pStyle w:val="ListParagraph"/>
-        <w:numPr>
-          <w:ilvl w:val="0"/>
-          <w:numId w:val="1"/>
-        </w:numPr>
-        <w:spacing w:after="40"/>
-      </w:pPr>
-      <w:r>
-        <w:t xml:space="preserve">View the Direct dashboard, or dashboards of L1, L3 or higher users (needs L4)</w:t>
+        <w:t xml:space="preserve">Open companies outside your locations that you do not handle (you see only basic facts)</w:t>
+      </w:r>
+    </w:p>
+    <w:p>
+      <w:pPr>
+        <w:pStyle w:val="ListParagraph"/>
+        <w:numPr>
+          <w:ilvl w:val="0"/>
+          <w:numId w:val="1"/>
+        </w:numPr>
+        <w:spacing w:after="40"/>
+      </w:pPr>
+      <w:r>
+        <w:t xml:space="preserve">View the Direct dashboard, or the dashboards of L1, L3 or higher users (needs L4)</w:t>
       </w:r>
     </w:p>
     <w:p>
@@ -527,6 +527,19 @@
     </w:p>
     <w:p>
       <w:pPr>
+        <w:pStyle w:val="ListParagraph"/>
+        <w:numPr>
+          <w:ilvl w:val="0"/>
+          <w:numId w:val="1"/>
+        </w:numPr>
+        <w:spacing w:after="40"/>
+      </w:pPr>
+      <w:r>
+        <w:t xml:space="preserve">Be a handler. A company you create is yours to handle.</w:t>
+      </w:r>
+    </w:p>
+    <w:p>
+      <w:pPr>
         <w:spacing w:after="50" w:before="100"/>
       </w:pPr>
       <w:r>
@@ -568,7 +581,20 @@
           <w:b/>
           <w:bCs/>
         </w:rPr>
-        <w:t xml:space="preserve">Same access as L4, with two differences:</w:t>
+        <w:t xml:space="preserve">Same access as L4, with these differences:</w:t>
+      </w:r>
+    </w:p>
+    <w:p>
+      <w:pPr>
+        <w:pStyle w:val="ListParagraph"/>
+        <w:numPr>
+          <w:ilvl w:val="0"/>
+          <w:numId w:val="1"/>
+        </w:numPr>
+        <w:spacing w:after="40"/>
+      </w:pPr>
+      <w:r>
+        <w:t xml:space="preserve">Your home page is an Overview with no personal sales figures. Pick a user there to see their dashboard.</w:t>
       </w:r>
     </w:p>
     <w:p>
@@ -594,7 +620,7 @@
         <w:spacing w:after="40"/>
       </w:pPr>
       <w:r>
-        <w:t xml:space="preserve">When you create a case, you must choose who it is assigned to.</w:t>
+        <w:t xml:space="preserve">When you create a case from a company page, you must choose who it is assigned to (a won order needs no assignee). A quick-logged case is assigned to you.</w:t>
       </w:r>
     </w:p>
     <w:p>
@@ -704,7 +730,7 @@
           <w:b/>
           <w:bCs/>
         </w:rPr>
-        <w:t xml:space="preserve">Like L5, you can never be a handler.</w:t>
+        <w:t xml:space="preserve">Like L5, you can never be a handler, and your home page is the Overview.</w:t>
       </w:r>
     </w:p>
     <w:p>
@@ -726,33 +752,33 @@
         <w:spacing w:after="40"/>
       </w:pPr>
       <w:r>
-        <w:t xml:space="preserve">Who owns a case: the handlers of its company. If the company has no real handler, Direct owns it, and only L4 and above (plus the assignee) can see it.</w:t>
-      </w:r>
-    </w:p>
-    <w:p>
-      <w:pPr>
-        <w:pStyle w:val="ListParagraph"/>
-        <w:numPr>
-          <w:ilvl w:val="0"/>
-          <w:numId w:val="1"/>
-        </w:numPr>
-        <w:spacing w:after="40"/>
-      </w:pPr>
-      <w:r>
-        <w:t xml:space="preserve">Creating a company makes you its handler (L2 to L4). There is no opt-out; ask an L3 or above to move it to someone else afterwards.</w:t>
-      </w:r>
-    </w:p>
-    <w:p>
-      <w:pPr>
-        <w:pStyle w:val="ListParagraph"/>
-        <w:numPr>
-          <w:ilvl w:val="0"/>
-          <w:numId w:val="1"/>
-        </w:numPr>
-        <w:spacing w:after="40"/>
-      </w:pPr>
-      <w:r>
-        <w:t xml:space="preserve">Removing the last handler of a company hands it to Direct. A company is never left with no owner.</w:t>
+        <w:t xml:space="preserve">Who owns a case: the handlers of its company. If the company has no real handler, Direct owns it. Direct is not a person, so such a case is seen only by L4 and above, L3 users in that location, and its assignee.</w:t>
+      </w:r>
+    </w:p>
+    <w:p>
+      <w:pPr>
+        <w:pStyle w:val="ListParagraph"/>
+        <w:numPr>
+          <w:ilvl w:val="0"/>
+          <w:numId w:val="1"/>
+        </w:numPr>
+        <w:spacing w:after="40"/>
+      </w:pPr>
+      <w:r>
+        <w:t xml:space="preserve">Creating a company makes you its handler (L2 to L4). To hand it over, add the new handler and then remove yourself, or ask an L3 or above.</w:t>
+      </w:r>
+    </w:p>
+    <w:p>
+      <w:pPr>
+        <w:pStyle w:val="ListParagraph"/>
+        <w:numPr>
+          <w:ilvl w:val="0"/>
+          <w:numId w:val="1"/>
+        </w:numPr>
+        <w:spacing w:after="40"/>
+      </w:pPr>
+      <w:r>
+        <w:t xml:space="preserve">Removing the last handler of a company hands it to Direct. A company is never left without an owner.</w:t>
       </w:r>
     </w:p>
     <w:p>
@@ -778,20 +804,33 @@
         <w:spacing w:after="40"/>
       </w:pPr>
       <w:r>
-        <w:t xml:space="preserve">An admin cannot take a location away from someone who still handles companies there. Those companies must first be given a new handler (another L2 to L4 user, or Direct).</w:t>
-      </w:r>
-    </w:p>
-    <w:p>
-      <w:pPr>
-        <w:pStyle w:val="ListParagraph"/>
-        <w:numPr>
-          <w:ilvl w:val="0"/>
-          <w:numId w:val="1"/>
-        </w:numPr>
-        <w:spacing w:after="40"/>
-      </w:pPr>
-      <w:r>
-        <w:t xml:space="preserve">Need more access? Ask an L3 or above for a specific company, or the L6 admin for your level or locations.</w:t>
+        <w:t xml:space="preserve">A case cannot exist without a company.</w:t>
+      </w:r>
+    </w:p>
+    <w:p>
+      <w:pPr>
+        <w:pStyle w:val="ListParagraph"/>
+        <w:numPr>
+          <w:ilvl w:val="0"/>
+          <w:numId w:val="1"/>
+        </w:numPr>
+        <w:spacing w:after="40"/>
+      </w:pPr>
+      <w:r>
+        <w:t xml:space="preserve">An admin cannot take a location away from someone who still handles companies there. Each of those companies must first be given a new handler: another active L2 to L4 user, or Direct.</w:t>
+      </w:r>
+    </w:p>
+    <w:p>
+      <w:pPr>
+        <w:pStyle w:val="ListParagraph"/>
+        <w:numPr>
+          <w:ilvl w:val="0"/>
+          <w:numId w:val="1"/>
+        </w:numPr>
+        <w:spacing w:after="40"/>
+      </w:pPr>
+      <w:r>
+        <w:t xml:space="preserve">Need more access to a company? Ask one of its handlers or an L3 or above to add you as a handler. For a new level or new locations, ask the L6 admin.</w:t>
       </w:r>
     </w:p>
     <w:sectPr>

</xml_diff>